<commit_message>
Set current PM to Sanae Takaichi; fix journalist list; add sample render
- Seed Prime Minister updated to Sanae Takaichi (LDP, first female PM,
  succeeded Ishiba) in digest.py leaders reference, PM-tracker query,
  keyword filter, README/CLAUDE/SOURCES/APPROVAL, and the overview doc.
- Remove Motoko Rich from flagged NYT Tokyo correspondents (no longer
  in the Tokyo bureau); sync collect.py, digest.py, and the doc.
- Add sample_digest.html: an illustrative rendered email (real
  render.py, representative content) previewing the format and all
  sections for the Japan Chair.
- Regenerate JAPAN_DIGEST_OVERVIEW.docx with the above.

Co-Authored-By: Claude Opus 4.8 <noreply@anthropic.com>
Claude-Session: https://claude.ai/code/session_015SHPw5CfgQxxJx7SF9rqZE
</commit_message>
<xml_diff>
--- a/JAPAN_DIGEST_OVERVIEW.docx
+++ b/JAPAN_DIGEST_OVERVIEW.docx
@@ -7297,7 +7297,7 @@
                 <w:sz w:val="18"/>
                 <w:szCs w:val="18"/>
               </w:rPr>
-              <w:t xml:space="preserve">PM (name fallback)</w:t>
+              <w:t xml:space="preserve">PM (by name)</w:t>
             </w:r>
           </w:p>
         </w:tc>
@@ -7324,7 +7324,7 @@
                 <w:sz w:val="18"/>
                 <w:szCs w:val="18"/>
               </w:rPr>
-              <w:t xml:space="preserve">"Ishiba" Japan Prime Minister</w:t>
+              <w:t xml:space="preserve">"Takaichi" OR "Ishiba" Japan Prime Minister</w:t>
             </w:r>
           </w:p>
         </w:tc>
@@ -7475,7 +7475,7 @@
                 <w:sz w:val="18"/>
                 <w:szCs w:val="18"/>
               </w:rPr>
-              <w:t xml:space="preserve">Motoko Rich (bureau chief), River Akira Davis, Hisako Ueno, Kiuko Notoya</w:t>
+              <w:t xml:space="preserve">River Akira Davis, Hisako Ueno, Kiuko Notoya</w:t>
             </w:r>
           </w:p>
         </w:tc>
@@ -9034,7 +9034,7 @@
         <w:t xml:space="preserve">Sitting Prime Minister. </w:t>
       </w:r>
       <w:r>
-        <w:t xml:space="preserve">The leadership reference is seeded with the last-known PM (Ishiba, LDP, since Oct 2024) and flagged "verify." Please confirm the current PM and cabinet. The live pipeline always defers to the name in the day's articles regardless.</w:t>
+        <w:t xml:space="preserve">The leadership reference is seeded with Sanae Takaichi (LDP, Japan's first female PM, who succeeded Ishiba). Please confirm her cabinet lineup so the seed baseline is complete. The live pipeline always defers to the name in the day's articles regardless.</w:t>
       </w:r>
     </w:p>
     <w:p>

</xml_diff>

<commit_message>
Seed Takaichi cabinet from official Kantei roster
Populate the leadership reference with the confirmed Takaichi Cabinet
(inaugurated Oct 21 2025, reshuffled Feb 18 2026): CCS Minoru Kihara,
FM Toshimitsu Motegi, Defense Shinjiro Koizumi, Finance Satsuki
Katayama (first female), METI Ryosei Akazawa, Internal Affairs
Yoshimasa Hayashi; BOJ Governor Kazuo Ueda. Update APPROVAL.md and
the overview .docx to match. Live pipeline still uses article names.

Co-Authored-By: Claude Opus 4.8 <noreply@anthropic.com>
Claude-Session: https://claude.ai/code/session_015SHPw5CfgQxxJx7SF9rqZE
</commit_message>
<xml_diff>
--- a/JAPAN_DIGEST_OVERVIEW.docx
+++ b/JAPAN_DIGEST_OVERVIEW.docx
@@ -9031,10 +9031,10 @@
           <w:b/>
           <w:bCs/>
         </w:rPr>
-        <w:t xml:space="preserve">Sitting Prime Minister. </w:t>
-      </w:r>
-      <w:r>
-        <w:t xml:space="preserve">The leadership reference is seeded with Sanae Takaichi (LDP, Japan's first female PM, who succeeded Ishiba). Please confirm her cabinet lineup so the seed baseline is complete. The live pipeline always defers to the name in the day's articles regardless.</w:t>
+        <w:t xml:space="preserve">Sitting Prime Minister &amp; cabinet. </w:t>
+      </w:r>
+      <w:r>
+        <w:t xml:space="preserve">Seeded from the official Kantei roster: PM Sanae Takaichi (LDP, first female PM; inaugurated Oct 21 2025, reshuffled Feb 18 2026), Chief Cabinet Secretary Minoru Kihara, Foreign Minister Toshimitsu Motegi, Defense Minister Shinjiro Koizumi, Finance Minister Satsuki Katayama, METI Minister Ryosei Akazawa, BOJ Governor Kazuo Ueda. Please confirm this is current. The live pipeline always defers to the names in the day's articles regardless.</w:t>
       </w:r>
     </w:p>
     <w:p>

</xml_diff>

<commit_message>
Working article URLs (decode Google News) + drop TOPIX
URLs: add a proper Google News URL decoder — scrape the per-article
signature/timestamp and POST Google's batchexecute endpoint to recover
the real publisher URL (modern news.google.com/rss/articles/CBMi... links
don't HTTP-redirect, which is why 0/121 resolved before). If decoding
fails, KEEP the Google News link (it still resolves in a browser) instead
of stripping it to blank. Only the ~30 URLs that land in the digest are
decoded (post-digest, 6 workers) rather than all ~120 pre-digest, to
avoid Google rate limits.

TOPIX: removed from the market strip — neither Yahoo (^TPX returns a bad
105.18 tick) nor Stooq delivers it reliably on the runner. The strip is
now Nikkei | USD/JPY two-across. Scrubbed from collect.py, docs, and the
overview .docx (kept as a keyword-filter term only).

Co-Authored-By: Claude Opus 4.8 <noreply@anthropic.com>
Claude-Session: https://claude.ai/code/session_015SHPw5CfgQxxJx7SF9rqZE
</commit_message>
<xml_diff>
--- a/JAPAN_DIGEST_OVERVIEW.docx
+++ b/JAPAN_DIGEST_OVERVIEW.docx
@@ -249,7 +249,7 @@
         <w:spacing w:after="60"/>
       </w:pPr>
       <w:r>
-        <w:t xml:space="preserve">Market Strip — Nikkei · TOPIX · USD/JPY · EUR/JPY · 10Y JGB · BOJ rate · Brent</w:t>
+        <w:t xml:space="preserve">Market Strip — Nikkei · USD/JPY · EUR/JPY · 10Y JGB · BOJ rate · Brent</w:t>
       </w:r>
     </w:p>
     <w:p>
@@ -8013,86 +8013,6 @@
                 <w:szCs w:val="18"/>
               </w:rPr>
               <w:t xml:space="preserve">Nikkei 225 (^N225)</w:t>
-            </w:r>
-          </w:p>
-        </w:tc>
-        <w:tc>
-          <w:tcPr>
-            <w:tcW w:type="dxa" w:w="2800"/>
-            <w:tcBorders>
-              <w:top w:val="single" w:color="CCCCCC" w:sz="1"/>
-              <w:left w:val="single" w:color="CCCCCC" w:sz="1"/>
-              <w:bottom w:val="single" w:color="CCCCCC" w:sz="1"/>
-              <w:right w:val="single" w:color="CCCCCC" w:sz="1"/>
-            </w:tcBorders>
-            <w:tcMar>
-              <w:top w:type="dxa" w:w="60"/>
-              <w:left w:type="dxa" w:w="120"/>
-              <w:bottom w:type="dxa" w:w="60"/>
-              <w:right w:type="dxa" w:w="120"/>
-            </w:tcMar>
-          </w:tcPr>
-          <w:p>
-            <w:r>
-              <w:rPr>
-                <w:sz w:val="18"/>
-                <w:szCs w:val="18"/>
-              </w:rPr>
-              <w:t xml:space="preserve">Yahoo Finance</w:t>
-            </w:r>
-          </w:p>
-        </w:tc>
-        <w:tc>
-          <w:tcPr>
-            <w:tcW w:type="dxa" w:w="2560"/>
-            <w:tcBorders>
-              <w:top w:val="single" w:color="CCCCCC" w:sz="1"/>
-              <w:left w:val="single" w:color="CCCCCC" w:sz="1"/>
-              <w:bottom w:val="single" w:color="CCCCCC" w:sz="1"/>
-              <w:right w:val="single" w:color="CCCCCC" w:sz="1"/>
-            </w:tcBorders>
-            <w:tcMar>
-              <w:top w:type="dxa" w:w="60"/>
-              <w:left w:type="dxa" w:w="120"/>
-              <w:bottom w:type="dxa" w:w="60"/>
-              <w:right w:type="dxa" w:w="120"/>
-            </w:tcMar>
-          </w:tcPr>
-          <w:p>
-            <w:r>
-              <w:rPr>
-                <w:sz w:val="18"/>
-                <w:szCs w:val="18"/>
-              </w:rPr>
-              <w:t xml:space="preserve">Stooq</w:t>
-            </w:r>
-          </w:p>
-        </w:tc>
-      </w:tr>
-      <w:tr>
-        <w:tc>
-          <w:tcPr>
-            <w:tcW w:type="dxa" w:w="4000"/>
-            <w:tcBorders>
-              <w:top w:val="single" w:color="CCCCCC" w:sz="1"/>
-              <w:left w:val="single" w:color="CCCCCC" w:sz="1"/>
-              <w:bottom w:val="single" w:color="CCCCCC" w:sz="1"/>
-              <w:right w:val="single" w:color="CCCCCC" w:sz="1"/>
-            </w:tcBorders>
-            <w:tcMar>
-              <w:top w:type="dxa" w:w="60"/>
-              <w:left w:type="dxa" w:w="120"/>
-              <w:bottom w:type="dxa" w:w="60"/>
-              <w:right w:type="dxa" w:w="120"/>
-            </w:tcMar>
-          </w:tcPr>
-          <w:p>
-            <w:r>
-              <w:rPr>
-                <w:sz w:val="18"/>
-                <w:szCs w:val="18"/>
-              </w:rPr>
-              <w:t xml:space="preserve">TOPIX (^TPX)</w:t>
             </w:r>
           </w:p>
         </w:tc>

</xml_diff>